<commit_message>
feat: cap nhat dashboard va template vat tu
</commit_message>
<xml_diff>
--- a/templates/dxvt-template.docx
+++ b/templates/dxvt-template.docx
@@ -715,6 +715,14 @@
               <w:spacing w:after="0" w:line="264" w:lineRule="auto"/>
               <w:jc w:val="center"/>
             </w:pPr>
+            <w:r>
+              <w:rPr>
+                <w:rFonts w:ascii="Times New Roman" w:hAnsi="Times New Roman" w:cs="Times New Roman"/>
+                <w:sz w:val="22"/>
+                <w:szCs w:val="22"/>
+              </w:rPr>
+              <w:t>{{khoVTTB}}</w:t>
+            </w:r>
           </w:p>
         </w:tc>
         <w:tc>
@@ -727,6 +735,14 @@
               <w:spacing w:after="0" w:line="264" w:lineRule="auto"/>
               <w:jc w:val="center"/>
             </w:pPr>
+            <w:r>
+              <w:rPr>
+                <w:rFonts w:ascii="Times New Roman" w:hAnsi="Times New Roman" w:cs="Times New Roman"/>
+                <w:sz w:val="22"/>
+                <w:szCs w:val="22"/>
+              </w:rPr>
+              <w:t>{{tonKho}}</w:t>
+            </w:r>
           </w:p>
         </w:tc>
         <w:tc>

</xml_diff>

<commit_message>
Bỏ chữ ký in sẵn khỏi mẫu Đề xuất vật tư
Mẫu cũ nhúng sẵn 2 ảnh chữ ký ở ô Trưởng phòng KHVT và Quản đốc PXVH 1; nay bỏ,
chỉ còn tên. Ô "Người đề nghị" vẫn giữ chữ ký động của Thống kê
({{#coChuKyThongKe}} {{%chuKyThongKe}} {{/coChuKyThongKe}}).

File giảm 88.420 → 15.184 byte (bỏ 2 ảnh nhúng). Kèm theo, bản lưu lại từ Word
cũng sửa được thẻ {{#items}} vốn bị Word cắt ngang giữa hai run trong mẫu cũ, và
bổ sung {{stt}} — biến này lib/dxvt-doc.ts đã cấp sẵn nên dùng được ngay.

Đã render thử tại chỗ bằng đúng cấu hình của lib/dxvt-doc.ts (2 dòng vật tư, chữ
ký thống kê): render thành công, vòng lặp items điền đủ, không sót placeholder,
ảnh chữ ký chèn được, và hai mốc XML mà code dựa vào để thay tên/chức vụ Quản đốc
(<w:t>Trương</w:t>, <w:t>QUẢN</w:t>) vẫn còn nguyên.

Co-Authored-By: Claude Opus 5 <noreply@anthropic.com>
</commit_message>
<xml_diff>
--- a/templates/dxvt-template.docx
+++ b/templates/dxvt-template.docx
@@ -238,16 +238,7 @@
           <w:sz w:val="26"/>
           <w:szCs w:val="26"/>
         </w:rPr>
-        <w:t xml:space="preserve">BBKT </w:t>
-      </w:r>
-      <w:proofErr w:type="gramStart"/>
-      <w:r>
-        <w:rPr>
-          <w:rFonts w:ascii="Times New Roman" w:hAnsi="Times New Roman" w:cs="Times New Roman"/>
-          <w:sz w:val="26"/>
-          <w:szCs w:val="26"/>
-        </w:rPr>
-        <w:t xml:space="preserve">số: </w:t>
+        <w:t xml:space="preserve">BBKT số: </w:t>
       </w:r>
       <w:r>
         <w:rPr>
@@ -257,7 +248,6 @@
         </w:rPr>
         <w:t>{{soBBKT}}.</w:t>
       </w:r>
-      <w:proofErr w:type="gramEnd"/>
     </w:p>
     <w:p>
       <w:pPr>
@@ -603,25 +593,7 @@
                 <w:sz w:val="22"/>
                 <w:szCs w:val="22"/>
               </w:rPr>
-              <w:t>{{#items</w:t>
-            </w:r>
-            <w:proofErr w:type="gramStart"/>
-            <w:r>
-              <w:rPr>
-                <w:rFonts w:ascii="Times New Roman" w:hAnsi="Times New Roman" w:cs="Times New Roman"/>
-                <w:sz w:val="22"/>
-                <w:szCs w:val="22"/>
-              </w:rPr>
-              <w:t>}}{</w:t>
-            </w:r>
-            <w:proofErr w:type="gramEnd"/>
-            <w:r>
-              <w:rPr>
-                <w:rFonts w:ascii="Times New Roman" w:hAnsi="Times New Roman" w:cs="Times New Roman"/>
-                <w:sz w:val="22"/>
-                <w:szCs w:val="22"/>
-              </w:rPr>
-              <w:t>{stt}}</w:t>
+              <w:t>{{#items}}{{stt}}</w:t>
             </w:r>
           </w:p>
         </w:tc>
@@ -839,40 +811,6 @@
                 <w:sz w:val="26"/>
               </w:rPr>
             </w:pPr>
-            <w:r>
-              <w:rPr>
-                <w:noProof/>
-              </w:rPr>
-              <w:pict w14:anchorId="457E8BE9">
-                <v:group id="Group 11" o:spid="_x0000_s1035" style="position:absolute;left:0;text-align:left;margin-left:7.75pt;margin-top:51.1pt;width:354pt;height:98pt;z-index:-251657216;mso-wrap-distance-left:0;mso-wrap-distance-right:0" coordsize="44958,12446" o:gfxdata="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">
-                  <v:shapetype id="_x0000_t75" coordsize="21600,21600" o:spt="75" o:preferrelative="t" path="m@4@5l@4@11@9@11@9@5xe" filled="f" stroked="f">
-                    <v:stroke joinstyle="miter"/>
-                    <v:formulas>
-                      <v:f eqn="if lineDrawn pixelLineWidth 0"/>
-                      <v:f eqn="sum @0 1 0"/>
-                      <v:f eqn="sum 0 0 @1"/>
-                      <v:f eqn="prod @2 1 2"/>
-                      <v:f eqn="prod @3 21600 pixelWidth"/>
-                      <v:f eqn="prod @3 21600 pixelHeight"/>
-                      <v:f eqn="sum @0 0 1"/>
-                      <v:f eqn="prod @6 1 2"/>
-                      <v:f eqn="prod @7 21600 pixelWidth"/>
-                      <v:f eqn="sum @8 21600 0"/>
-                      <v:f eqn="prod @7 21600 pixelHeight"/>
-                      <v:f eqn="sum @10 21600 0"/>
-                    </v:formulas>
-                    <v:path o:extrusionok="f" gradientshapeok="t" o:connecttype="rect"/>
-                    <o:lock v:ext="edit" aspectratio="t"/>
-                  </v:shapetype>
-                  <v:shape id="Image 12" o:spid="_x0000_s1036" type="#_x0000_t75" style="position:absolute;left:20066;width:24892;height:12446;visibility:visible;mso-wrap-style:square" o:gfxdata="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">
-                    <v:imagedata r:id="rId4" o:title=""/>
-                  </v:shape>
-                  <v:shape id="Image 13" o:spid="_x0000_s1037" type="#_x0000_t75" style="position:absolute;width:24892;height:12446;visibility:visible;mso-wrap-style:square" o:gfxdata="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">
-                    <v:imagedata r:id="rId5" o:title=""/>
-                  </v:shape>
-                </v:group>
-              </w:pict>
-            </w:r>
             <w:r>
               <w:rPr>
                 <w:b/>

</xml_diff>